<commit_message>
Add Baseline v2 and SCM essay; keep v1 for course evolution; repo English-only
</commit_message>
<xml_diff>
--- a/Baseline_Documento/Baseline_SMMyE_V1.docx
+++ b/Baseline_Documento/Baseline_SMMyE_V1.docx
@@ -23,12 +23,6 @@
         <w:gridCol w:w="9350"/>
       </w:tblGrid>
       <w:tr>
-        <w:tblPrEx>
-          <w:tblCellMar>
-            <w:top w:w="0" w:type="dxa"/>
-            <w:bottom w:w="0" w:type="dxa"/>
-          </w:tblCellMar>
-        </w:tblPrEx>
         <w:trPr>
           <w:trHeight w:hRule="exact" w:val="820"/>
         </w:trPr>
@@ -172,8 +166,18 @@
           <w:bCs/>
           <w:color w:val="1F4E79"/>
         </w:rPr>
-        <w:t>Descripción breve</w:t>
-      </w:r>
+        <w:t xml:space="preserve">General </w:t>
+      </w:r>
+      <w:proofErr w:type="spellStart"/>
+      <w:r>
+        <w:rPr>
+          <w:b/>
+          <w:bCs/>
+          <w:color w:val="1F4E79"/>
+        </w:rPr>
+        <w:t>Description</w:t>
+      </w:r>
+      <w:proofErr w:type="spellEnd"/>
     </w:p>
     <w:p>
       <w:pPr>
@@ -987,15 +991,7 @@
       </w:r>
       <w:proofErr w:type="spellEnd"/>
       <w:r>
-        <w:t xml:space="preserve"> (MCP) </w:t>
-      </w:r>
-      <w:proofErr w:type="gramStart"/>
-      <w:r>
-        <w:t>server</w:t>
-      </w:r>
-      <w:proofErr w:type="gramEnd"/>
-      <w:r>
-        <w:t xml:space="preserve">. </w:t>
+        <w:t xml:space="preserve"> (MCP) server. </w:t>
       </w:r>
       <w:proofErr w:type="spellStart"/>
       <w:r>
@@ -1035,15 +1031,7 @@
       </w:r>
       <w:proofErr w:type="spellEnd"/>
       <w:r>
-        <w:t xml:space="preserve"> </w:t>
-      </w:r>
-      <w:proofErr w:type="gramStart"/>
-      <w:r>
-        <w:t>in natural</w:t>
-      </w:r>
-      <w:proofErr w:type="gramEnd"/>
-      <w:r>
-        <w:t xml:space="preserve"> </w:t>
+        <w:t xml:space="preserve"> in natural </w:t>
       </w:r>
       <w:proofErr w:type="spellStart"/>
       <w:r>
@@ -1580,12 +1568,6 @@
         <w:gridCol w:w="1100"/>
       </w:tblGrid>
       <w:tr>
-        <w:tblPrEx>
-          <w:tblCellMar>
-            <w:top w:w="0" w:type="dxa"/>
-            <w:bottom w:w="0" w:type="dxa"/>
-          </w:tblCellMar>
-        </w:tblPrEx>
         <w:trPr>
           <w:tblHeader/>
         </w:trPr>
@@ -1687,12 +1669,6 @@
         </w:tc>
       </w:tr>
       <w:tr>
-        <w:tblPrEx>
-          <w:tblCellMar>
-            <w:top w:w="0" w:type="dxa"/>
-            <w:bottom w:w="0" w:type="dxa"/>
-          </w:tblCellMar>
-        </w:tblPrEx>
         <w:tc>
           <w:tcPr>
             <w:tcW w:w="1100" w:type="dxa"/>
@@ -1849,7 +1825,6 @@
               <w:t xml:space="preserve"> and </w:t>
             </w:r>
             <w:proofErr w:type="spellStart"/>
-            <w:proofErr w:type="gramStart"/>
             <w:r>
               <w:rPr>
                 <w:color w:val="000000"/>
@@ -1859,7 +1834,6 @@
               <w:t>password</w:t>
             </w:r>
             <w:proofErr w:type="spellEnd"/>
-            <w:proofErr w:type="gramEnd"/>
             <w:r>
               <w:rPr>
                 <w:color w:val="000000"/>
@@ -2024,12 +1998,6 @@
         </w:tc>
       </w:tr>
       <w:tr>
-        <w:tblPrEx>
-          <w:tblCellMar>
-            <w:top w:w="0" w:type="dxa"/>
-            <w:bottom w:w="0" w:type="dxa"/>
-          </w:tblCellMar>
-        </w:tblPrEx>
         <w:tc>
           <w:tcPr>
             <w:tcW w:w="1100" w:type="dxa"/>
@@ -2413,12 +2381,6 @@
         </w:tc>
       </w:tr>
       <w:tr>
-        <w:tblPrEx>
-          <w:tblCellMar>
-            <w:top w:w="0" w:type="dxa"/>
-            <w:bottom w:w="0" w:type="dxa"/>
-          </w:tblCellMar>
-        </w:tblPrEx>
         <w:tc>
           <w:tcPr>
             <w:tcW w:w="1100" w:type="dxa"/>
@@ -2766,12 +2728,6 @@
         </w:tc>
       </w:tr>
       <w:tr>
-        <w:tblPrEx>
-          <w:tblCellMar>
-            <w:top w:w="0" w:type="dxa"/>
-            <w:bottom w:w="0" w:type="dxa"/>
-          </w:tblCellMar>
-        </w:tblPrEx>
         <w:tc>
           <w:tcPr>
             <w:tcW w:w="1100" w:type="dxa"/>
@@ -3101,12 +3057,6 @@
         </w:tc>
       </w:tr>
       <w:tr>
-        <w:tblPrEx>
-          <w:tblCellMar>
-            <w:top w:w="0" w:type="dxa"/>
-            <w:bottom w:w="0" w:type="dxa"/>
-          </w:tblCellMar>
-        </w:tblPrEx>
         <w:tc>
           <w:tcPr>
             <w:tcW w:w="1100" w:type="dxa"/>
@@ -3472,12 +3422,6 @@
         </w:tc>
       </w:tr>
       <w:tr>
-        <w:tblPrEx>
-          <w:tblCellMar>
-            <w:top w:w="0" w:type="dxa"/>
-            <w:bottom w:w="0" w:type="dxa"/>
-          </w:tblCellMar>
-        </w:tblPrEx>
         <w:tc>
           <w:tcPr>
             <w:tcW w:w="1100" w:type="dxa"/>
@@ -3843,12 +3787,6 @@
         </w:tc>
       </w:tr>
       <w:tr>
-        <w:tblPrEx>
-          <w:tblCellMar>
-            <w:top w:w="0" w:type="dxa"/>
-            <w:bottom w:w="0" w:type="dxa"/>
-          </w:tblCellMar>
-        </w:tblPrEx>
         <w:tc>
           <w:tcPr>
             <w:tcW w:w="1100" w:type="dxa"/>
@@ -4178,12 +4116,6 @@
         </w:tc>
       </w:tr>
       <w:tr>
-        <w:tblPrEx>
-          <w:tblCellMar>
-            <w:top w:w="0" w:type="dxa"/>
-            <w:bottom w:w="0" w:type="dxa"/>
-          </w:tblCellMar>
-        </w:tblPrEx>
         <w:tc>
           <w:tcPr>
             <w:tcW w:w="1100" w:type="dxa"/>
@@ -4585,12 +4517,6 @@
         </w:tc>
       </w:tr>
       <w:tr>
-        <w:tblPrEx>
-          <w:tblCellMar>
-            <w:top w:w="0" w:type="dxa"/>
-            <w:bottom w:w="0" w:type="dxa"/>
-          </w:tblCellMar>
-        </w:tblPrEx>
         <w:tc>
           <w:tcPr>
             <w:tcW w:w="1100" w:type="dxa"/>
@@ -4866,12 +4792,6 @@
         </w:tc>
       </w:tr>
       <w:tr>
-        <w:tblPrEx>
-          <w:tblCellMar>
-            <w:top w:w="0" w:type="dxa"/>
-            <w:bottom w:w="0" w:type="dxa"/>
-          </w:tblCellMar>
-        </w:tblPrEx>
         <w:tc>
           <w:tcPr>
             <w:tcW w:w="1100" w:type="dxa"/>
@@ -5165,12 +5085,6 @@
         </w:tc>
       </w:tr>
       <w:tr>
-        <w:tblPrEx>
-          <w:tblCellMar>
-            <w:top w:w="0" w:type="dxa"/>
-            <w:bottom w:w="0" w:type="dxa"/>
-          </w:tblCellMar>
-        </w:tblPrEx>
         <w:tc>
           <w:tcPr>
             <w:tcW w:w="1100" w:type="dxa"/>
@@ -5447,12 +5361,6 @@
         </w:tc>
       </w:tr>
       <w:tr>
-        <w:tblPrEx>
-          <w:tblCellMar>
-            <w:top w:w="0" w:type="dxa"/>
-            <w:bottom w:w="0" w:type="dxa"/>
-          </w:tblCellMar>
-        </w:tblPrEx>
         <w:tc>
           <w:tcPr>
             <w:tcW w:w="1100" w:type="dxa"/>
@@ -5588,25 +5496,7 @@
                 <w:sz w:val="20"/>
                 <w:szCs w:val="20"/>
               </w:rPr>
-              <w:t xml:space="preserve"> </w:t>
-            </w:r>
-            <w:proofErr w:type="gramStart"/>
-            <w:r>
-              <w:rPr>
-                <w:color w:val="000000"/>
-                <w:sz w:val="20"/>
-                <w:szCs w:val="20"/>
-              </w:rPr>
-              <w:t>in natural</w:t>
-            </w:r>
-            <w:proofErr w:type="gramEnd"/>
-            <w:r>
-              <w:rPr>
-                <w:color w:val="000000"/>
-                <w:sz w:val="20"/>
-                <w:szCs w:val="20"/>
-              </w:rPr>
-              <w:t xml:space="preserve"> </w:t>
+              <w:t xml:space="preserve"> in natural </w:t>
             </w:r>
             <w:proofErr w:type="spellStart"/>
             <w:r>
@@ -5764,12 +5654,6 @@
         </w:tc>
       </w:tr>
       <w:tr>
-        <w:tblPrEx>
-          <w:tblCellMar>
-            <w:top w:w="0" w:type="dxa"/>
-            <w:bottom w:w="0" w:type="dxa"/>
-          </w:tblCellMar>
-        </w:tblPrEx>
         <w:tc>
           <w:tcPr>
             <w:tcW w:w="1100" w:type="dxa"/>
@@ -6159,7 +6043,6 @@
       </w:pPr>
     </w:p>
     <w:p>
-      <w:proofErr w:type="gramStart"/>
       <w:r>
         <w:rPr>
           <w:i/>
@@ -6168,18 +6051,7 @@
           <w:sz w:val="20"/>
           <w:szCs w:val="20"/>
         </w:rPr>
-        <w:t>Total</w:t>
-      </w:r>
-      <w:proofErr w:type="gramEnd"/>
-      <w:r>
-        <w:rPr>
-          <w:i/>
-          <w:iCs/>
-          <w:color w:val="5B6770"/>
-          <w:sz w:val="20"/>
-          <w:szCs w:val="20"/>
-        </w:rPr>
-        <w:t xml:space="preserve"> backlog: 13 </w:t>
+        <w:t xml:space="preserve">Total backlog: 13 </w:t>
       </w:r>
       <w:proofErr w:type="spellStart"/>
       <w:r>
@@ -7048,12 +6920,10 @@
         <w:t xml:space="preserve"> and </w:t>
       </w:r>
       <w:proofErr w:type="spellStart"/>
-      <w:proofErr w:type="gramStart"/>
       <w:r>
         <w:t>password</w:t>
       </w:r>
       <w:proofErr w:type="spellEnd"/>
-      <w:proofErr w:type="gramEnd"/>
       <w:r>
         <w:t xml:space="preserve">. The API </w:t>
       </w:r>
@@ -7717,15 +7587,7 @@
       </w:r>
       <w:proofErr w:type="spellEnd"/>
       <w:r>
-        <w:t xml:space="preserve"> </w:t>
-      </w:r>
-      <w:proofErr w:type="gramStart"/>
-      <w:r>
-        <w:t>status</w:t>
-      </w:r>
-      <w:proofErr w:type="gramEnd"/>
-      <w:r>
-        <w:t xml:space="preserve"> </w:t>
+        <w:t xml:space="preserve"> status </w:t>
       </w:r>
       <w:proofErr w:type="spellStart"/>
       <w:r>
@@ -7908,15 +7770,7 @@
       </w:r>
       <w:proofErr w:type="spellEnd"/>
       <w:r>
-        <w:t xml:space="preserve"> </w:t>
-      </w:r>
-      <w:proofErr w:type="gramStart"/>
-      <w:r>
-        <w:t>status</w:t>
-      </w:r>
-      <w:proofErr w:type="gramEnd"/>
-      <w:r>
-        <w:t xml:space="preserve"> </w:t>
+        <w:t xml:space="preserve"> status </w:t>
       </w:r>
       <w:proofErr w:type="spellStart"/>
       <w:r>
@@ -8171,15 +8025,7 @@
       </w:r>
       <w:proofErr w:type="spellEnd"/>
       <w:r>
-        <w:t xml:space="preserve"> </w:t>
-      </w:r>
-      <w:proofErr w:type="gramStart"/>
-      <w:r>
-        <w:t>status</w:t>
-      </w:r>
-      <w:proofErr w:type="gramEnd"/>
-      <w:r>
-        <w:t xml:space="preserve"> </w:t>
+        <w:t xml:space="preserve"> status </w:t>
       </w:r>
       <w:proofErr w:type="spellStart"/>
       <w:r>
@@ -11210,12 +11056,6 @@
         <w:gridCol w:w="3400"/>
       </w:tblGrid>
       <w:tr>
-        <w:tblPrEx>
-          <w:tblCellMar>
-            <w:top w:w="0" w:type="dxa"/>
-            <w:bottom w:w="0" w:type="dxa"/>
-          </w:tblCellMar>
-        </w:tblPrEx>
         <w:trPr>
           <w:tblHeader/>
         </w:trPr>
@@ -11337,12 +11177,6 @@
         </w:tc>
       </w:tr>
       <w:tr>
-        <w:tblPrEx>
-          <w:tblCellMar>
-            <w:top w:w="0" w:type="dxa"/>
-            <w:bottom w:w="0" w:type="dxa"/>
-          </w:tblCellMar>
-        </w:tblPrEx>
         <w:tc>
           <w:tcPr>
             <w:tcW w:w="2850" w:type="dxa"/>
@@ -11522,12 +11356,6 @@
         </w:tc>
       </w:tr>
       <w:tr>
-        <w:tblPrEx>
-          <w:tblCellMar>
-            <w:top w:w="0" w:type="dxa"/>
-            <w:bottom w:w="0" w:type="dxa"/>
-          </w:tblCellMar>
-        </w:tblPrEx>
         <w:tc>
           <w:tcPr>
             <w:tcW w:w="2850" w:type="dxa"/>
@@ -11723,12 +11551,6 @@
         </w:tc>
       </w:tr>
       <w:tr>
-        <w:tblPrEx>
-          <w:tblCellMar>
-            <w:top w:w="0" w:type="dxa"/>
-            <w:bottom w:w="0" w:type="dxa"/>
-          </w:tblCellMar>
-        </w:tblPrEx>
         <w:tc>
           <w:tcPr>
             <w:tcW w:w="2850" w:type="dxa"/>
@@ -11892,25 +11714,7 @@
                 <w:sz w:val="20"/>
                 <w:szCs w:val="20"/>
               </w:rPr>
-              <w:t xml:space="preserve"> and </w:t>
-            </w:r>
-            <w:proofErr w:type="gramStart"/>
-            <w:r>
-              <w:rPr>
-                <w:color w:val="000000"/>
-                <w:sz w:val="20"/>
-                <w:szCs w:val="20"/>
-              </w:rPr>
-              <w:t>interface</w:t>
-            </w:r>
-            <w:proofErr w:type="gramEnd"/>
-            <w:r>
-              <w:rPr>
-                <w:color w:val="000000"/>
-                <w:sz w:val="20"/>
-                <w:szCs w:val="20"/>
-              </w:rPr>
-              <w:t xml:space="preserve"> </w:t>
+              <w:t xml:space="preserve"> and interface </w:t>
             </w:r>
             <w:proofErr w:type="spellStart"/>
             <w:r>
@@ -11944,12 +11748,6 @@
         </w:tc>
       </w:tr>
       <w:tr>
-        <w:tblPrEx>
-          <w:tblCellMar>
-            <w:top w:w="0" w:type="dxa"/>
-            <w:bottom w:w="0" w:type="dxa"/>
-          </w:tblCellMar>
-        </w:tblPrEx>
         <w:tc>
           <w:tcPr>
             <w:tcW w:w="2850" w:type="dxa"/>
@@ -12137,12 +11935,6 @@
         </w:tc>
       </w:tr>
       <w:tr>
-        <w:tblPrEx>
-          <w:tblCellMar>
-            <w:top w:w="0" w:type="dxa"/>
-            <w:bottom w:w="0" w:type="dxa"/>
-          </w:tblCellMar>
-        </w:tblPrEx>
         <w:tc>
           <w:tcPr>
             <w:tcW w:w="2850" w:type="dxa"/>
@@ -12348,12 +12140,6 @@
         </w:tc>
       </w:tr>
       <w:tr>
-        <w:tblPrEx>
-          <w:tblCellMar>
-            <w:top w:w="0" w:type="dxa"/>
-            <w:bottom w:w="0" w:type="dxa"/>
-          </w:tblCellMar>
-        </w:tblPrEx>
         <w:tc>
           <w:tcPr>
             <w:tcW w:w="2850" w:type="dxa"/>
@@ -12515,12 +12301,6 @@
         </w:tc>
       </w:tr>
       <w:tr>
-        <w:tblPrEx>
-          <w:tblCellMar>
-            <w:top w:w="0" w:type="dxa"/>
-            <w:bottom w:w="0" w:type="dxa"/>
-          </w:tblCellMar>
-        </w:tblPrEx>
         <w:tc>
           <w:tcPr>
             <w:tcW w:w="2850" w:type="dxa"/>
@@ -12738,12 +12518,6 @@
         <w:gridCol w:w="3650"/>
       </w:tblGrid>
       <w:tr>
-        <w:tblPrEx>
-          <w:tblCellMar>
-            <w:top w:w="0" w:type="dxa"/>
-            <w:bottom w:w="0" w:type="dxa"/>
-          </w:tblCellMar>
-        </w:tblPrEx>
         <w:trPr>
           <w:tblHeader/>
         </w:trPr>
@@ -12865,12 +12639,6 @@
         </w:tc>
       </w:tr>
       <w:tr>
-        <w:tblPrEx>
-          <w:tblCellMar>
-            <w:top w:w="0" w:type="dxa"/>
-            <w:bottom w:w="0" w:type="dxa"/>
-          </w:tblCellMar>
-        </w:tblPrEx>
         <w:tc>
           <w:tcPr>
             <w:tcW w:w="3300" w:type="dxa"/>
@@ -13022,12 +12790,6 @@
         </w:tc>
       </w:tr>
       <w:tr>
-        <w:tblPrEx>
-          <w:tblCellMar>
-            <w:top w:w="0" w:type="dxa"/>
-            <w:bottom w:w="0" w:type="dxa"/>
-          </w:tblCellMar>
-        </w:tblPrEx>
         <w:tc>
           <w:tcPr>
             <w:tcW w:w="3300" w:type="dxa"/>
@@ -13197,12 +12959,6 @@
         </w:tc>
       </w:tr>
       <w:tr>
-        <w:tblPrEx>
-          <w:tblCellMar>
-            <w:top w:w="0" w:type="dxa"/>
-            <w:bottom w:w="0" w:type="dxa"/>
-          </w:tblCellMar>
-        </w:tblPrEx>
         <w:tc>
           <w:tcPr>
             <w:tcW w:w="3300" w:type="dxa"/>
@@ -13398,12 +13154,6 @@
         </w:tc>
       </w:tr>
       <w:tr>
-        <w:tblPrEx>
-          <w:tblCellMar>
-            <w:top w:w="0" w:type="dxa"/>
-            <w:bottom w:w="0" w:type="dxa"/>
-          </w:tblCellMar>
-        </w:tblPrEx>
         <w:tc>
           <w:tcPr>
             <w:tcW w:w="3300" w:type="dxa"/>
@@ -13625,12 +13375,6 @@
         </w:tc>
       </w:tr>
       <w:tr>
-        <w:tblPrEx>
-          <w:tblCellMar>
-            <w:top w:w="0" w:type="dxa"/>
-            <w:bottom w:w="0" w:type="dxa"/>
-          </w:tblCellMar>
-        </w:tblPrEx>
         <w:tc>
           <w:tcPr>
             <w:tcW w:w="3300" w:type="dxa"/>
@@ -13774,25 +13518,7 @@
                 <w:sz w:val="20"/>
                 <w:szCs w:val="20"/>
               </w:rPr>
-              <w:t xml:space="preserve"> n8n, MCP </w:t>
-            </w:r>
-            <w:proofErr w:type="gramStart"/>
-            <w:r>
-              <w:rPr>
-                <w:color w:val="000000"/>
-                <w:sz w:val="20"/>
-                <w:szCs w:val="20"/>
-              </w:rPr>
-              <w:t>server</w:t>
-            </w:r>
-            <w:proofErr w:type="gramEnd"/>
-            <w:r>
-              <w:rPr>
-                <w:color w:val="000000"/>
-                <w:sz w:val="20"/>
-                <w:szCs w:val="20"/>
-              </w:rPr>
-              <w:t xml:space="preserve"> and Ollama</w:t>
+              <w:t xml:space="preserve"> n8n, MCP server and Ollama</w:t>
             </w:r>
           </w:p>
         </w:tc>
@@ -13827,12 +13553,6 @@
         <w:gridCol w:w="3650"/>
       </w:tblGrid>
       <w:tr>
-        <w:tblPrEx>
-          <w:tblCellMar>
-            <w:top w:w="0" w:type="dxa"/>
-            <w:bottom w:w="0" w:type="dxa"/>
-          </w:tblCellMar>
-        </w:tblPrEx>
         <w:tc>
           <w:tcPr>
             <w:tcW w:w="3300" w:type="dxa"/>
@@ -13993,7 +13713,15 @@
       </w:r>
       <w:proofErr w:type="spellEnd"/>
       <w:r>
-        <w:t xml:space="preserve"> Backend </w:t>
+        <w:t xml:space="preserve"> </w:t>
+      </w:r>
+      <w:proofErr w:type="spellStart"/>
+      <w:r>
+        <w:t>Backend</w:t>
+      </w:r>
+      <w:proofErr w:type="spellEnd"/>
+      <w:r>
+        <w:t xml:space="preserve"> </w:t>
       </w:r>
       <w:proofErr w:type="spellStart"/>
       <w:r>
@@ -14092,12 +13820,6 @@
         <w:gridCol w:w="2300"/>
       </w:tblGrid>
       <w:tr>
-        <w:tblPrEx>
-          <w:tblCellMar>
-            <w:top w:w="0" w:type="dxa"/>
-            <w:bottom w:w="0" w:type="dxa"/>
-          </w:tblCellMar>
-        </w:tblPrEx>
         <w:trPr>
           <w:tblHeader/>
         </w:trPr>
@@ -14223,7 +13945,6 @@
             <w:pPr>
               <w:jc w:val="center"/>
             </w:pPr>
-            <w:proofErr w:type="gramStart"/>
             <w:r>
               <w:rPr>
                 <w:b/>
@@ -14232,18 +13953,7 @@
                 <w:sz w:val="20"/>
                 <w:szCs w:val="20"/>
               </w:rPr>
-              <w:t>Total</w:t>
-            </w:r>
-            <w:proofErr w:type="gramEnd"/>
-            <w:r>
-              <w:rPr>
-                <w:b/>
-                <w:bCs/>
-                <w:color w:val="FFFFFF"/>
-                <w:sz w:val="20"/>
-                <w:szCs w:val="20"/>
-              </w:rPr>
-              <w:t xml:space="preserve"> </w:t>
+              <w:t xml:space="preserve">Total </w:t>
             </w:r>
             <w:proofErr w:type="spellStart"/>
             <w:r>
@@ -14283,12 +13993,6 @@
         </w:tc>
       </w:tr>
       <w:tr>
-        <w:tblPrEx>
-          <w:tblCellMar>
-            <w:top w:w="0" w:type="dxa"/>
-            <w:bottom w:w="0" w:type="dxa"/>
-          </w:tblCellMar>
-        </w:tblPrEx>
         <w:tc>
           <w:tcPr>
             <w:tcW w:w="3900" w:type="dxa"/>
@@ -14410,12 +14114,6 @@
         </w:tc>
       </w:tr>
       <w:tr>
-        <w:tblPrEx>
-          <w:tblCellMar>
-            <w:top w:w="0" w:type="dxa"/>
-            <w:bottom w:w="0" w:type="dxa"/>
-          </w:tblCellMar>
-        </w:tblPrEx>
         <w:tc>
           <w:tcPr>
             <w:tcW w:w="3900" w:type="dxa"/>
@@ -14429,13 +14127,23 @@
             <w:vAlign w:val="center"/>
           </w:tcPr>
           <w:p>
-            <w:r>
-              <w:rPr>
-                <w:color w:val="000000"/>
-                <w:sz w:val="20"/>
-                <w:szCs w:val="20"/>
-              </w:rPr>
-              <w:t xml:space="preserve">Backend </w:t>
+            <w:proofErr w:type="spellStart"/>
+            <w:r>
+              <w:rPr>
+                <w:color w:val="000000"/>
+                <w:sz w:val="20"/>
+                <w:szCs w:val="20"/>
+              </w:rPr>
+              <w:t>Backend</w:t>
+            </w:r>
+            <w:proofErr w:type="spellEnd"/>
+            <w:r>
+              <w:rPr>
+                <w:color w:val="000000"/>
+                <w:sz w:val="20"/>
+                <w:szCs w:val="20"/>
+              </w:rPr>
+              <w:t xml:space="preserve"> </w:t>
             </w:r>
             <w:proofErr w:type="spellStart"/>
             <w:r>
@@ -14547,12 +14255,6 @@
         </w:tc>
       </w:tr>
       <w:tr>
-        <w:tblPrEx>
-          <w:tblCellMar>
-            <w:top w:w="0" w:type="dxa"/>
-            <w:bottom w:w="0" w:type="dxa"/>
-          </w:tblCellMar>
-        </w:tblPrEx>
         <w:tc>
           <w:tcPr>
             <w:tcW w:w="3900" w:type="dxa"/>
@@ -14656,12 +14358,6 @@
         </w:tc>
       </w:tr>
       <w:tr>
-        <w:tblPrEx>
-          <w:tblCellMar>
-            <w:top w:w="0" w:type="dxa"/>
-            <w:bottom w:w="0" w:type="dxa"/>
-          </w:tblCellMar>
-        </w:tblPrEx>
         <w:tc>
           <w:tcPr>
             <w:tcW w:w="3900" w:type="dxa"/>
@@ -14820,12 +14516,6 @@
         </w:tc>
       </w:tr>
       <w:tr>
-        <w:tblPrEx>
-          <w:tblCellMar>
-            <w:top w:w="0" w:type="dxa"/>
-            <w:bottom w:w="0" w:type="dxa"/>
-          </w:tblCellMar>
-        </w:tblPrEx>
         <w:tc>
           <w:tcPr>
             <w:tcW w:w="3900" w:type="dxa"/>
@@ -14947,12 +14637,6 @@
         </w:tc>
       </w:tr>
       <w:tr>
-        <w:tblPrEx>
-          <w:tblCellMar>
-            <w:top w:w="0" w:type="dxa"/>
-            <w:bottom w:w="0" w:type="dxa"/>
-          </w:tblCellMar>
-        </w:tblPrEx>
         <w:tc>
           <w:tcPr>
             <w:tcW w:w="3900" w:type="dxa"/>
@@ -15103,12 +14787,6 @@
         <w:gridCol w:w="2300"/>
       </w:tblGrid>
       <w:tr>
-        <w:tblPrEx>
-          <w:tblCellMar>
-            <w:top w:w="0" w:type="dxa"/>
-            <w:bottom w:w="0" w:type="dxa"/>
-          </w:tblCellMar>
-        </w:tblPrEx>
         <w:tc>
           <w:tcPr>
             <w:tcW w:w="3900" w:type="dxa"/>
@@ -15272,15 +14950,7 @@
       </w:r>
       <w:proofErr w:type="spellEnd"/>
       <w:r>
-        <w:t xml:space="preserve"> as free: </w:t>
-      </w:r>
-      <w:proofErr w:type="gramStart"/>
-      <w:r>
-        <w:t>server</w:t>
-      </w:r>
-      <w:proofErr w:type="gramEnd"/>
-      <w:r>
-        <w:t xml:space="preserve"> hosting, GPU </w:t>
+        <w:t xml:space="preserve"> as free: server hosting, GPU </w:t>
       </w:r>
       <w:proofErr w:type="spellStart"/>
       <w:r>
@@ -15354,12 +15024,6 @@
         <w:gridCol w:w="2800"/>
       </w:tblGrid>
       <w:tr>
-        <w:tblPrEx>
-          <w:tblCellMar>
-            <w:top w:w="0" w:type="dxa"/>
-            <w:bottom w:w="0" w:type="dxa"/>
-          </w:tblCellMar>
-        </w:tblPrEx>
         <w:trPr>
           <w:tblHeader/>
         </w:trPr>
@@ -15507,12 +15171,6 @@
         </w:tc>
       </w:tr>
       <w:tr>
-        <w:tblPrEx>
-          <w:tblCellMar>
-            <w:top w:w="0" w:type="dxa"/>
-            <w:bottom w:w="0" w:type="dxa"/>
-          </w:tblCellMar>
-        </w:tblPrEx>
         <w:tc>
           <w:tcPr>
             <w:tcW w:w="4200" w:type="dxa"/>
@@ -15618,12 +15276,6 @@
         </w:tc>
       </w:tr>
       <w:tr>
-        <w:tblPrEx>
-          <w:tblCellMar>
-            <w:top w:w="0" w:type="dxa"/>
-            <w:bottom w:w="0" w:type="dxa"/>
-          </w:tblCellMar>
-        </w:tblPrEx>
         <w:tc>
           <w:tcPr>
             <w:tcW w:w="4200" w:type="dxa"/>
@@ -15737,12 +15389,6 @@
         </w:tc>
       </w:tr>
       <w:tr>
-        <w:tblPrEx>
-          <w:tblCellMar>
-            <w:top w:w="0" w:type="dxa"/>
-            <w:bottom w:w="0" w:type="dxa"/>
-          </w:tblCellMar>
-        </w:tblPrEx>
         <w:tc>
           <w:tcPr>
             <w:tcW w:w="4200" w:type="dxa"/>
@@ -15946,7 +15592,6 @@
       <w:pPr>
         <w:spacing w:before="60" w:after="160"/>
       </w:pPr>
-      <w:proofErr w:type="gramStart"/>
       <w:r>
         <w:rPr>
           <w:b/>
@@ -15954,17 +15599,7 @@
           <w:sz w:val="26"/>
           <w:szCs w:val="26"/>
         </w:rPr>
-        <w:t>Total</w:t>
-      </w:r>
-      <w:proofErr w:type="gramEnd"/>
-      <w:r>
-        <w:rPr>
-          <w:b/>
-          <w:bCs/>
-          <w:sz w:val="26"/>
-          <w:szCs w:val="26"/>
-        </w:rPr>
-        <w:t xml:space="preserve"> </w:t>
+        <w:t xml:space="preserve">Total </w:t>
       </w:r>
       <w:proofErr w:type="spellStart"/>
       <w:r>

</xml_diff>